<commit_message>
Add Inital Document material
</commit_message>
<xml_diff>
--- a/Notes/Data Dictionary.docx
+++ b/Notes/Data Dictionary.docx
@@ -11,10 +11,18 @@
       </w:pPr>
       <w:r>
         <w:rPr>
+          <w:rFonts w:ascii="Segoe UI Emoji" w:hAnsi="Segoe UI Emoji" w:cs="Segoe UI Emoji"/>
           <w:b/>
           <w:bCs/>
         </w:rPr>
-        <w:t>Data Dictionary</w:t>
+        <w:t>📑</w:t>
+      </w:r>
+      <w:r>
+        <w:rPr>
+          <w:b/>
+          <w:bCs/>
+        </w:rPr>
+        <w:t xml:space="preserve"> Data Dictionary</w:t>
       </w:r>
     </w:p>
     <w:p>
@@ -29,7 +37,7 @@
           <w:b/>
           <w:bCs/>
         </w:rPr>
-        <w:t>1. Customer</w:t>
+        <w:t>User Table</w:t>
       </w:r>
     </w:p>
     <w:tbl>
@@ -45,10 +53,10 @@
         <w:tblLook w:val="04A0" w:firstRow="1" w:lastRow="0" w:firstColumn="1" w:lastColumn="0" w:noHBand="0" w:noVBand="1"/>
       </w:tblPr>
       <w:tblGrid>
-        <w:gridCol w:w="1383"/>
-        <w:gridCol w:w="2545"/>
-        <w:gridCol w:w="2538"/>
-        <w:gridCol w:w="2894"/>
+        <w:gridCol w:w="1196"/>
+        <w:gridCol w:w="2587"/>
+        <w:gridCol w:w="2542"/>
+        <w:gridCol w:w="3035"/>
       </w:tblGrid>
       <w:tr>
         <w:trPr>
@@ -155,19 +163,39 @@
             <w:hideMark/>
           </w:tcPr>
           <w:p>
-            <w:r>
-              <w:t>customer_id</w:t>
-            </w:r>
-          </w:p>
-        </w:tc>
-        <w:tc>
-          <w:tcPr>
-            <w:tcW w:w="0" w:type="auto"/>
-            <w:vAlign w:val="center"/>
-            <w:hideMark/>
-          </w:tcPr>
-          <w:p>
-            <w:r>
+            <w:pPr>
+              <w:rPr>
+                <w:b/>
+                <w:bCs/>
+              </w:rPr>
+            </w:pPr>
+            <w:r>
+              <w:rPr>
+                <w:b/>
+                <w:bCs/>
+              </w:rPr>
+              <w:t>user_ID</w:t>
+            </w:r>
+          </w:p>
+        </w:tc>
+        <w:tc>
+          <w:tcPr>
+            <w:tcW w:w="0" w:type="auto"/>
+            <w:vAlign w:val="center"/>
+            <w:hideMark/>
+          </w:tcPr>
+          <w:p>
+            <w:pPr>
+              <w:rPr>
+                <w:b/>
+                <w:bCs/>
+              </w:rPr>
+            </w:pPr>
+            <w:r>
+              <w:rPr>
+                <w:b/>
+                <w:bCs/>
+              </w:rPr>
               <w:t>INT</w:t>
             </w:r>
           </w:p>
@@ -179,7 +207,17 @@
             <w:hideMark/>
           </w:tcPr>
           <w:p>
-            <w:r>
+            <w:pPr>
+              <w:rPr>
+                <w:b/>
+                <w:bCs/>
+              </w:rPr>
+            </w:pPr>
+            <w:r>
+              <w:rPr>
+                <w:b/>
+                <w:bCs/>
+              </w:rPr>
               <w:t>PK, AUTO_INCREMENT</w:t>
             </w:r>
           </w:p>
@@ -191,8 +229,18 @@
             <w:hideMark/>
           </w:tcPr>
           <w:p>
-            <w:r>
-              <w:t>Unique identifier for each customer</w:t>
+            <w:pPr>
+              <w:rPr>
+                <w:b/>
+                <w:bCs/>
+              </w:rPr>
+            </w:pPr>
+            <w:r>
+              <w:rPr>
+                <w:b/>
+                <w:bCs/>
+              </w:rPr>
+              <w:t>Unique identifier for each user</w:t>
             </w:r>
           </w:p>
         </w:tc>
@@ -208,7 +256,17 @@
             <w:hideMark/>
           </w:tcPr>
           <w:p>
-            <w:r>
+            <w:pPr>
+              <w:rPr>
+                <w:b/>
+                <w:bCs/>
+              </w:rPr>
+            </w:pPr>
+            <w:r>
+              <w:rPr>
+                <w:b/>
+                <w:bCs/>
+              </w:rPr>
               <w:t>name</w:t>
             </w:r>
           </w:p>
@@ -220,7 +278,17 @@
             <w:hideMark/>
           </w:tcPr>
           <w:p>
-            <w:r>
+            <w:pPr>
+              <w:rPr>
+                <w:b/>
+                <w:bCs/>
+              </w:rPr>
+            </w:pPr>
+            <w:r>
+              <w:rPr>
+                <w:b/>
+                <w:bCs/>
+              </w:rPr>
               <w:t>VARCHAR(100)</w:t>
             </w:r>
           </w:p>
@@ -232,7 +300,17 @@
             <w:hideMark/>
           </w:tcPr>
           <w:p>
-            <w:r>
+            <w:pPr>
+              <w:rPr>
+                <w:b/>
+                <w:bCs/>
+              </w:rPr>
+            </w:pPr>
+            <w:r>
+              <w:rPr>
+                <w:b/>
+                <w:bCs/>
+              </w:rPr>
               <w:t>NOT NULL</w:t>
             </w:r>
           </w:p>
@@ -244,8 +322,18 @@
             <w:hideMark/>
           </w:tcPr>
           <w:p>
-            <w:r>
-              <w:t>Customer’s full name</w:t>
+            <w:pPr>
+              <w:rPr>
+                <w:b/>
+                <w:bCs/>
+              </w:rPr>
+            </w:pPr>
+            <w:r>
+              <w:rPr>
+                <w:b/>
+                <w:bCs/>
+              </w:rPr>
+              <w:t>User’s full name</w:t>
             </w:r>
           </w:p>
         </w:tc>
@@ -261,7 +349,17 @@
             <w:hideMark/>
           </w:tcPr>
           <w:p>
-            <w:r>
+            <w:pPr>
+              <w:rPr>
+                <w:b/>
+                <w:bCs/>
+              </w:rPr>
+            </w:pPr>
+            <w:r>
+              <w:rPr>
+                <w:b/>
+                <w:bCs/>
+              </w:rPr>
               <w:t>email</w:t>
             </w:r>
           </w:p>
@@ -273,7 +371,17 @@
             <w:hideMark/>
           </w:tcPr>
           <w:p>
-            <w:r>
+            <w:pPr>
+              <w:rPr>
+                <w:b/>
+                <w:bCs/>
+              </w:rPr>
+            </w:pPr>
+            <w:r>
+              <w:rPr>
+                <w:b/>
+                <w:bCs/>
+              </w:rPr>
               <w:t>VARCHAR(100)</w:t>
             </w:r>
           </w:p>
@@ -285,7 +393,17 @@
             <w:hideMark/>
           </w:tcPr>
           <w:p>
-            <w:r>
+            <w:pPr>
+              <w:rPr>
+                <w:b/>
+                <w:bCs/>
+              </w:rPr>
+            </w:pPr>
+            <w:r>
+              <w:rPr>
+                <w:b/>
+                <w:bCs/>
+              </w:rPr>
               <w:t>UNIQUE, NOT NULL</w:t>
             </w:r>
           </w:p>
@@ -297,8 +415,18 @@
             <w:hideMark/>
           </w:tcPr>
           <w:p>
-            <w:r>
-              <w:t>Customer’s email address</w:t>
+            <w:pPr>
+              <w:rPr>
+                <w:b/>
+                <w:bCs/>
+              </w:rPr>
+            </w:pPr>
+            <w:r>
+              <w:rPr>
+                <w:b/>
+                <w:bCs/>
+              </w:rPr>
+              <w:t>User’s email address</w:t>
             </w:r>
           </w:p>
         </w:tc>
@@ -314,7 +442,17 @@
             <w:hideMark/>
           </w:tcPr>
           <w:p>
-            <w:r>
+            <w:pPr>
+              <w:rPr>
+                <w:b/>
+                <w:bCs/>
+              </w:rPr>
+            </w:pPr>
+            <w:r>
+              <w:rPr>
+                <w:b/>
+                <w:bCs/>
+              </w:rPr>
               <w:t>password</w:t>
             </w:r>
           </w:p>
@@ -326,7 +464,17 @@
             <w:hideMark/>
           </w:tcPr>
           <w:p>
-            <w:r>
+            <w:pPr>
+              <w:rPr>
+                <w:b/>
+                <w:bCs/>
+              </w:rPr>
+            </w:pPr>
+            <w:r>
+              <w:rPr>
+                <w:b/>
+                <w:bCs/>
+              </w:rPr>
               <w:t>VARCHAR(255)</w:t>
             </w:r>
           </w:p>
@@ -338,7 +486,17 @@
             <w:hideMark/>
           </w:tcPr>
           <w:p>
-            <w:r>
+            <w:pPr>
+              <w:rPr>
+                <w:b/>
+                <w:bCs/>
+              </w:rPr>
+            </w:pPr>
+            <w:r>
+              <w:rPr>
+                <w:b/>
+                <w:bCs/>
+              </w:rPr>
               <w:t>NOT NULL</w:t>
             </w:r>
           </w:p>
@@ -350,7 +508,17 @@
             <w:hideMark/>
           </w:tcPr>
           <w:p>
-            <w:r>
+            <w:pPr>
+              <w:rPr>
+                <w:b/>
+                <w:bCs/>
+              </w:rPr>
+            </w:pPr>
+            <w:r>
+              <w:rPr>
+                <w:b/>
+                <w:bCs/>
+              </w:rPr>
               <w:t>Encrypted login password</w:t>
             </w:r>
           </w:p>
@@ -367,7 +535,17 @@
             <w:hideMark/>
           </w:tcPr>
           <w:p>
-            <w:r>
+            <w:pPr>
+              <w:rPr>
+                <w:b/>
+                <w:bCs/>
+              </w:rPr>
+            </w:pPr>
+            <w:r>
+              <w:rPr>
+                <w:b/>
+                <w:bCs/>
+              </w:rPr>
               <w:t>address</w:t>
             </w:r>
           </w:p>
@@ -379,7 +557,17 @@
             <w:hideMark/>
           </w:tcPr>
           <w:p>
-            <w:r>
+            <w:pPr>
+              <w:rPr>
+                <w:b/>
+                <w:bCs/>
+              </w:rPr>
+            </w:pPr>
+            <w:r>
+              <w:rPr>
+                <w:b/>
+                <w:bCs/>
+              </w:rPr>
               <w:t>VARCHAR(255)</w:t>
             </w:r>
           </w:p>
@@ -391,7 +579,17 @@
             <w:hideMark/>
           </w:tcPr>
           <w:p>
-            <w:r>
+            <w:pPr>
+              <w:rPr>
+                <w:b/>
+                <w:bCs/>
+              </w:rPr>
+            </w:pPr>
+            <w:r>
+              <w:rPr>
+                <w:b/>
+                <w:bCs/>
+              </w:rPr>
               <w:t>NULL</w:t>
             </w:r>
           </w:p>
@@ -403,8 +601,18 @@
             <w:hideMark/>
           </w:tcPr>
           <w:p>
-            <w:r>
-              <w:t>Customer’s residential address</w:t>
+            <w:pPr>
+              <w:rPr>
+                <w:b/>
+                <w:bCs/>
+              </w:rPr>
+            </w:pPr>
+            <w:r>
+              <w:rPr>
+                <w:b/>
+                <w:bCs/>
+              </w:rPr>
+              <w:t>User’s residential address</w:t>
             </w:r>
           </w:p>
         </w:tc>
@@ -420,7 +628,17 @@
             <w:hideMark/>
           </w:tcPr>
           <w:p>
-            <w:r>
+            <w:pPr>
+              <w:rPr>
+                <w:b/>
+                <w:bCs/>
+              </w:rPr>
+            </w:pPr>
+            <w:r>
+              <w:rPr>
+                <w:b/>
+                <w:bCs/>
+              </w:rPr>
               <w:t>phone</w:t>
             </w:r>
           </w:p>
@@ -432,7 +650,17 @@
             <w:hideMark/>
           </w:tcPr>
           <w:p>
-            <w:r>
+            <w:pPr>
+              <w:rPr>
+                <w:b/>
+                <w:bCs/>
+              </w:rPr>
+            </w:pPr>
+            <w:r>
+              <w:rPr>
+                <w:b/>
+                <w:bCs/>
+              </w:rPr>
               <w:t>VARCHAR(20)</w:t>
             </w:r>
           </w:p>
@@ -444,7 +672,17 @@
             <w:hideMark/>
           </w:tcPr>
           <w:p>
-            <w:r>
+            <w:pPr>
+              <w:rPr>
+                <w:b/>
+                <w:bCs/>
+              </w:rPr>
+            </w:pPr>
+            <w:r>
+              <w:rPr>
+                <w:b/>
+                <w:bCs/>
+              </w:rPr>
               <w:t>NULL</w:t>
             </w:r>
           </w:p>
@@ -456,8 +694,18 @@
             <w:hideMark/>
           </w:tcPr>
           <w:p>
-            <w:r>
-              <w:t>Customer’s phone number</w:t>
+            <w:pPr>
+              <w:rPr>
+                <w:b/>
+                <w:bCs/>
+              </w:rPr>
+            </w:pPr>
+            <w:r>
+              <w:rPr>
+                <w:b/>
+                <w:bCs/>
+              </w:rPr>
+              <w:t>User’s phone number</w:t>
             </w:r>
           </w:p>
         </w:tc>
@@ -473,7 +721,17 @@
             <w:hideMark/>
           </w:tcPr>
           <w:p>
-            <w:r>
+            <w:pPr>
+              <w:rPr>
+                <w:b/>
+                <w:bCs/>
+              </w:rPr>
+            </w:pPr>
+            <w:r>
+              <w:rPr>
+                <w:b/>
+                <w:bCs/>
+              </w:rPr>
               <w:t>role</w:t>
             </w:r>
           </w:p>
@@ -485,7 +743,17 @@
             <w:hideMark/>
           </w:tcPr>
           <w:p>
-            <w:r>
+            <w:pPr>
+              <w:rPr>
+                <w:b/>
+                <w:bCs/>
+              </w:rPr>
+            </w:pPr>
+            <w:r>
+              <w:rPr>
+                <w:b/>
+                <w:bCs/>
+              </w:rPr>
               <w:t>ENUM(Admin, Seller, Buyer)</w:t>
             </w:r>
           </w:p>
@@ -497,7 +765,17 @@
             <w:hideMark/>
           </w:tcPr>
           <w:p>
-            <w:r>
+            <w:pPr>
+              <w:rPr>
+                <w:b/>
+                <w:bCs/>
+              </w:rPr>
+            </w:pPr>
+            <w:r>
+              <w:rPr>
+                <w:b/>
+                <w:bCs/>
+              </w:rPr>
               <w:t>NOT NULL</w:t>
             </w:r>
           </w:p>
@@ -509,7 +787,17 @@
             <w:hideMark/>
           </w:tcPr>
           <w:p>
-            <w:r>
+            <w:pPr>
+              <w:rPr>
+                <w:b/>
+                <w:bCs/>
+              </w:rPr>
+            </w:pPr>
+            <w:r>
+              <w:rPr>
+                <w:b/>
+                <w:bCs/>
+              </w:rPr>
               <w:t>Defines user type for authentication</w:t>
             </w:r>
           </w:p>
@@ -528,7 +816,7 @@
           <w:b/>
           <w:bCs/>
         </w:rPr>
-        <w:t>2. Category</w:t>
+        <w:t>Product Table</w:t>
       </w:r>
     </w:p>
     <w:tbl>
@@ -544,10 +832,10 @@
         <w:tblLook w:val="04A0" w:firstRow="1" w:lastRow="0" w:firstColumn="1" w:lastColumn="0" w:noHBand="0" w:noVBand="1"/>
       </w:tblPr>
       <w:tblGrid>
-        <w:gridCol w:w="1730"/>
-        <w:gridCol w:w="1776"/>
-        <w:gridCol w:w="2628"/>
-        <w:gridCol w:w="3226"/>
+        <w:gridCol w:w="1449"/>
+        <w:gridCol w:w="1803"/>
+        <w:gridCol w:w="3081"/>
+        <w:gridCol w:w="3027"/>
       </w:tblGrid>
       <w:tr>
         <w:trPr>
@@ -654,19 +942,39 @@
             <w:hideMark/>
           </w:tcPr>
           <w:p>
-            <w:r>
-              <w:t>category_id</w:t>
-            </w:r>
-          </w:p>
-        </w:tc>
-        <w:tc>
-          <w:tcPr>
-            <w:tcW w:w="0" w:type="auto"/>
-            <w:vAlign w:val="center"/>
-            <w:hideMark/>
-          </w:tcPr>
-          <w:p>
-            <w:r>
+            <w:pPr>
+              <w:rPr>
+                <w:b/>
+                <w:bCs/>
+              </w:rPr>
+            </w:pPr>
+            <w:r>
+              <w:rPr>
+                <w:b/>
+                <w:bCs/>
+              </w:rPr>
+              <w:t>product_ID</w:t>
+            </w:r>
+          </w:p>
+        </w:tc>
+        <w:tc>
+          <w:tcPr>
+            <w:tcW w:w="0" w:type="auto"/>
+            <w:vAlign w:val="center"/>
+            <w:hideMark/>
+          </w:tcPr>
+          <w:p>
+            <w:pPr>
+              <w:rPr>
+                <w:b/>
+                <w:bCs/>
+              </w:rPr>
+            </w:pPr>
+            <w:r>
+              <w:rPr>
+                <w:b/>
+                <w:bCs/>
+              </w:rPr>
               <w:t>INT</w:t>
             </w:r>
           </w:p>
@@ -678,7 +986,17 @@
             <w:hideMark/>
           </w:tcPr>
           <w:p>
-            <w:r>
+            <w:pPr>
+              <w:rPr>
+                <w:b/>
+                <w:bCs/>
+              </w:rPr>
+            </w:pPr>
+            <w:r>
+              <w:rPr>
+                <w:b/>
+                <w:bCs/>
+              </w:rPr>
               <w:t>PK, AUTO_INCREMENT</w:t>
             </w:r>
           </w:p>
@@ -690,8 +1008,18 @@
             <w:hideMark/>
           </w:tcPr>
           <w:p>
-            <w:r>
-              <w:t>Unique identifier for each category</w:t>
+            <w:pPr>
+              <w:rPr>
+                <w:b/>
+                <w:bCs/>
+              </w:rPr>
+            </w:pPr>
+            <w:r>
+              <w:rPr>
+                <w:b/>
+                <w:bCs/>
+              </w:rPr>
+              <w:t>Unique identifier for each product</w:t>
             </w:r>
           </w:p>
         </w:tc>
@@ -707,19 +1035,39 @@
             <w:hideMark/>
           </w:tcPr>
           <w:p>
-            <w:r>
-              <w:t>category_name</w:t>
-            </w:r>
-          </w:p>
-        </w:tc>
-        <w:tc>
-          <w:tcPr>
-            <w:tcW w:w="0" w:type="auto"/>
-            <w:vAlign w:val="center"/>
-            <w:hideMark/>
-          </w:tcPr>
-          <w:p>
-            <w:r>
+            <w:pPr>
+              <w:rPr>
+                <w:b/>
+                <w:bCs/>
+              </w:rPr>
+            </w:pPr>
+            <w:r>
+              <w:rPr>
+                <w:b/>
+                <w:bCs/>
+              </w:rPr>
+              <w:t>name</w:t>
+            </w:r>
+          </w:p>
+        </w:tc>
+        <w:tc>
+          <w:tcPr>
+            <w:tcW w:w="0" w:type="auto"/>
+            <w:vAlign w:val="center"/>
+            <w:hideMark/>
+          </w:tcPr>
+          <w:p>
+            <w:pPr>
+              <w:rPr>
+                <w:b/>
+                <w:bCs/>
+              </w:rPr>
+            </w:pPr>
+            <w:r>
+              <w:rPr>
+                <w:b/>
+                <w:bCs/>
+              </w:rPr>
               <w:t>VARCHAR(100)</w:t>
             </w:r>
           </w:p>
@@ -731,7 +1079,17 @@
             <w:hideMark/>
           </w:tcPr>
           <w:p>
-            <w:r>
+            <w:pPr>
+              <w:rPr>
+                <w:b/>
+                <w:bCs/>
+              </w:rPr>
+            </w:pPr>
+            <w:r>
+              <w:rPr>
+                <w:b/>
+                <w:bCs/>
+              </w:rPr>
               <w:t>NOT NULL</w:t>
             </w:r>
           </w:p>
@@ -743,8 +1101,577 @@
             <w:hideMark/>
           </w:tcPr>
           <w:p>
-            <w:r>
-              <w:t>Name of product category</w:t>
+            <w:pPr>
+              <w:rPr>
+                <w:b/>
+                <w:bCs/>
+              </w:rPr>
+            </w:pPr>
+            <w:r>
+              <w:rPr>
+                <w:b/>
+                <w:bCs/>
+              </w:rPr>
+              <w:t>Product name</w:t>
+            </w:r>
+          </w:p>
+        </w:tc>
+      </w:tr>
+      <w:tr>
+        <w:trPr>
+          <w:tblCellSpacing w:w="15" w:type="dxa"/>
+        </w:trPr>
+        <w:tc>
+          <w:tcPr>
+            <w:tcW w:w="0" w:type="auto"/>
+            <w:vAlign w:val="center"/>
+            <w:hideMark/>
+          </w:tcPr>
+          <w:p>
+            <w:pPr>
+              <w:rPr>
+                <w:b/>
+                <w:bCs/>
+              </w:rPr>
+            </w:pPr>
+            <w:r>
+              <w:rPr>
+                <w:b/>
+                <w:bCs/>
+              </w:rPr>
+              <w:t>description</w:t>
+            </w:r>
+          </w:p>
+        </w:tc>
+        <w:tc>
+          <w:tcPr>
+            <w:tcW w:w="0" w:type="auto"/>
+            <w:vAlign w:val="center"/>
+            <w:hideMark/>
+          </w:tcPr>
+          <w:p>
+            <w:pPr>
+              <w:rPr>
+                <w:b/>
+                <w:bCs/>
+              </w:rPr>
+            </w:pPr>
+            <w:r>
+              <w:rPr>
+                <w:b/>
+                <w:bCs/>
+              </w:rPr>
+              <w:t>TEXT</w:t>
+            </w:r>
+          </w:p>
+        </w:tc>
+        <w:tc>
+          <w:tcPr>
+            <w:tcW w:w="0" w:type="auto"/>
+            <w:vAlign w:val="center"/>
+            <w:hideMark/>
+          </w:tcPr>
+          <w:p>
+            <w:pPr>
+              <w:rPr>
+                <w:b/>
+                <w:bCs/>
+              </w:rPr>
+            </w:pPr>
+            <w:r>
+              <w:rPr>
+                <w:b/>
+                <w:bCs/>
+              </w:rPr>
+              <w:t>NULL</w:t>
+            </w:r>
+          </w:p>
+        </w:tc>
+        <w:tc>
+          <w:tcPr>
+            <w:tcW w:w="0" w:type="auto"/>
+            <w:vAlign w:val="center"/>
+            <w:hideMark/>
+          </w:tcPr>
+          <w:p>
+            <w:pPr>
+              <w:rPr>
+                <w:b/>
+                <w:bCs/>
+              </w:rPr>
+            </w:pPr>
+            <w:r>
+              <w:rPr>
+                <w:b/>
+                <w:bCs/>
+              </w:rPr>
+              <w:t>Detailed product description</w:t>
+            </w:r>
+          </w:p>
+        </w:tc>
+      </w:tr>
+      <w:tr>
+        <w:trPr>
+          <w:tblCellSpacing w:w="15" w:type="dxa"/>
+        </w:trPr>
+        <w:tc>
+          <w:tcPr>
+            <w:tcW w:w="0" w:type="auto"/>
+            <w:vAlign w:val="center"/>
+            <w:hideMark/>
+          </w:tcPr>
+          <w:p>
+            <w:pPr>
+              <w:rPr>
+                <w:b/>
+                <w:bCs/>
+              </w:rPr>
+            </w:pPr>
+            <w:r>
+              <w:rPr>
+                <w:b/>
+                <w:bCs/>
+              </w:rPr>
+              <w:t>brand</w:t>
+            </w:r>
+          </w:p>
+        </w:tc>
+        <w:tc>
+          <w:tcPr>
+            <w:tcW w:w="0" w:type="auto"/>
+            <w:vAlign w:val="center"/>
+            <w:hideMark/>
+          </w:tcPr>
+          <w:p>
+            <w:pPr>
+              <w:rPr>
+                <w:b/>
+                <w:bCs/>
+              </w:rPr>
+            </w:pPr>
+            <w:r>
+              <w:rPr>
+                <w:b/>
+                <w:bCs/>
+              </w:rPr>
+              <w:t>VARCHAR(50)</w:t>
+            </w:r>
+          </w:p>
+        </w:tc>
+        <w:tc>
+          <w:tcPr>
+            <w:tcW w:w="0" w:type="auto"/>
+            <w:vAlign w:val="center"/>
+            <w:hideMark/>
+          </w:tcPr>
+          <w:p>
+            <w:pPr>
+              <w:rPr>
+                <w:b/>
+                <w:bCs/>
+              </w:rPr>
+            </w:pPr>
+            <w:r>
+              <w:rPr>
+                <w:b/>
+                <w:bCs/>
+              </w:rPr>
+              <w:t>NULL</w:t>
+            </w:r>
+          </w:p>
+        </w:tc>
+        <w:tc>
+          <w:tcPr>
+            <w:tcW w:w="0" w:type="auto"/>
+            <w:vAlign w:val="center"/>
+            <w:hideMark/>
+          </w:tcPr>
+          <w:p>
+            <w:pPr>
+              <w:rPr>
+                <w:b/>
+                <w:bCs/>
+              </w:rPr>
+            </w:pPr>
+            <w:r>
+              <w:rPr>
+                <w:b/>
+                <w:bCs/>
+              </w:rPr>
+              <w:t>Product brand</w:t>
+            </w:r>
+          </w:p>
+        </w:tc>
+      </w:tr>
+      <w:tr>
+        <w:trPr>
+          <w:tblCellSpacing w:w="15" w:type="dxa"/>
+        </w:trPr>
+        <w:tc>
+          <w:tcPr>
+            <w:tcW w:w="0" w:type="auto"/>
+            <w:vAlign w:val="center"/>
+            <w:hideMark/>
+          </w:tcPr>
+          <w:p>
+            <w:pPr>
+              <w:rPr>
+                <w:b/>
+                <w:bCs/>
+              </w:rPr>
+            </w:pPr>
+            <w:r>
+              <w:rPr>
+                <w:b/>
+                <w:bCs/>
+              </w:rPr>
+              <w:t>stock</w:t>
+            </w:r>
+          </w:p>
+        </w:tc>
+        <w:tc>
+          <w:tcPr>
+            <w:tcW w:w="0" w:type="auto"/>
+            <w:vAlign w:val="center"/>
+            <w:hideMark/>
+          </w:tcPr>
+          <w:p>
+            <w:pPr>
+              <w:rPr>
+                <w:b/>
+                <w:bCs/>
+              </w:rPr>
+            </w:pPr>
+            <w:r>
+              <w:rPr>
+                <w:b/>
+                <w:bCs/>
+              </w:rPr>
+              <w:t>INT</w:t>
+            </w:r>
+          </w:p>
+        </w:tc>
+        <w:tc>
+          <w:tcPr>
+            <w:tcW w:w="0" w:type="auto"/>
+            <w:vAlign w:val="center"/>
+            <w:hideMark/>
+          </w:tcPr>
+          <w:p>
+            <w:pPr>
+              <w:rPr>
+                <w:b/>
+                <w:bCs/>
+              </w:rPr>
+            </w:pPr>
+            <w:r>
+              <w:rPr>
+                <w:b/>
+                <w:bCs/>
+              </w:rPr>
+              <w:t>NOT NULL</w:t>
+            </w:r>
+          </w:p>
+        </w:tc>
+        <w:tc>
+          <w:tcPr>
+            <w:tcW w:w="0" w:type="auto"/>
+            <w:vAlign w:val="center"/>
+            <w:hideMark/>
+          </w:tcPr>
+          <w:p>
+            <w:pPr>
+              <w:rPr>
+                <w:b/>
+                <w:bCs/>
+              </w:rPr>
+            </w:pPr>
+            <w:r>
+              <w:rPr>
+                <w:b/>
+                <w:bCs/>
+              </w:rPr>
+              <w:t>Available quantity in inventory</w:t>
+            </w:r>
+          </w:p>
+        </w:tc>
+      </w:tr>
+      <w:tr>
+        <w:trPr>
+          <w:tblCellSpacing w:w="15" w:type="dxa"/>
+        </w:trPr>
+        <w:tc>
+          <w:tcPr>
+            <w:tcW w:w="0" w:type="auto"/>
+            <w:vAlign w:val="center"/>
+            <w:hideMark/>
+          </w:tcPr>
+          <w:p>
+            <w:pPr>
+              <w:rPr>
+                <w:b/>
+                <w:bCs/>
+              </w:rPr>
+            </w:pPr>
+            <w:r>
+              <w:rPr>
+                <w:b/>
+                <w:bCs/>
+              </w:rPr>
+              <w:t>image</w:t>
+            </w:r>
+          </w:p>
+        </w:tc>
+        <w:tc>
+          <w:tcPr>
+            <w:tcW w:w="0" w:type="auto"/>
+            <w:vAlign w:val="center"/>
+            <w:hideMark/>
+          </w:tcPr>
+          <w:p>
+            <w:pPr>
+              <w:rPr>
+                <w:b/>
+                <w:bCs/>
+              </w:rPr>
+            </w:pPr>
+            <w:r>
+              <w:rPr>
+                <w:b/>
+                <w:bCs/>
+              </w:rPr>
+              <w:t>VARCHAR(255)</w:t>
+            </w:r>
+          </w:p>
+        </w:tc>
+        <w:tc>
+          <w:tcPr>
+            <w:tcW w:w="0" w:type="auto"/>
+            <w:vAlign w:val="center"/>
+            <w:hideMark/>
+          </w:tcPr>
+          <w:p>
+            <w:pPr>
+              <w:rPr>
+                <w:b/>
+                <w:bCs/>
+              </w:rPr>
+            </w:pPr>
+            <w:r>
+              <w:rPr>
+                <w:b/>
+                <w:bCs/>
+              </w:rPr>
+              <w:t>NULL</w:t>
+            </w:r>
+          </w:p>
+        </w:tc>
+        <w:tc>
+          <w:tcPr>
+            <w:tcW w:w="0" w:type="auto"/>
+            <w:vAlign w:val="center"/>
+            <w:hideMark/>
+          </w:tcPr>
+          <w:p>
+            <w:pPr>
+              <w:rPr>
+                <w:b/>
+                <w:bCs/>
+              </w:rPr>
+            </w:pPr>
+            <w:r>
+              <w:rPr>
+                <w:b/>
+                <w:bCs/>
+              </w:rPr>
+              <w:t>Path/URL to product image</w:t>
+            </w:r>
+          </w:p>
+        </w:tc>
+      </w:tr>
+      <w:tr>
+        <w:trPr>
+          <w:tblCellSpacing w:w="15" w:type="dxa"/>
+        </w:trPr>
+        <w:tc>
+          <w:tcPr>
+            <w:tcW w:w="0" w:type="auto"/>
+            <w:vAlign w:val="center"/>
+            <w:hideMark/>
+          </w:tcPr>
+          <w:p>
+            <w:pPr>
+              <w:rPr>
+                <w:b/>
+                <w:bCs/>
+              </w:rPr>
+            </w:pPr>
+            <w:r>
+              <w:rPr>
+                <w:b/>
+                <w:bCs/>
+              </w:rPr>
+              <w:t>price</w:t>
+            </w:r>
+          </w:p>
+        </w:tc>
+        <w:tc>
+          <w:tcPr>
+            <w:tcW w:w="0" w:type="auto"/>
+            <w:vAlign w:val="center"/>
+            <w:hideMark/>
+          </w:tcPr>
+          <w:p>
+            <w:pPr>
+              <w:rPr>
+                <w:b/>
+                <w:bCs/>
+              </w:rPr>
+            </w:pPr>
+            <w:r>
+              <w:rPr>
+                <w:b/>
+                <w:bCs/>
+              </w:rPr>
+              <w:t>DECIMAL(10,2)</w:t>
+            </w:r>
+          </w:p>
+        </w:tc>
+        <w:tc>
+          <w:tcPr>
+            <w:tcW w:w="0" w:type="auto"/>
+            <w:vAlign w:val="center"/>
+            <w:hideMark/>
+          </w:tcPr>
+          <w:p>
+            <w:pPr>
+              <w:rPr>
+                <w:b/>
+                <w:bCs/>
+              </w:rPr>
+            </w:pPr>
+            <w:r>
+              <w:rPr>
+                <w:b/>
+                <w:bCs/>
+              </w:rPr>
+              <w:t>NOT NULL</w:t>
+            </w:r>
+          </w:p>
+        </w:tc>
+        <w:tc>
+          <w:tcPr>
+            <w:tcW w:w="0" w:type="auto"/>
+            <w:vAlign w:val="center"/>
+            <w:hideMark/>
+          </w:tcPr>
+          <w:p>
+            <w:pPr>
+              <w:rPr>
+                <w:b/>
+                <w:bCs/>
+              </w:rPr>
+            </w:pPr>
+            <w:r>
+              <w:rPr>
+                <w:b/>
+                <w:bCs/>
+              </w:rPr>
+              <w:t>Product price</w:t>
+            </w:r>
+          </w:p>
+        </w:tc>
+      </w:tr>
+      <w:tr>
+        <w:trPr>
+          <w:tblCellSpacing w:w="15" w:type="dxa"/>
+        </w:trPr>
+        <w:tc>
+          <w:tcPr>
+            <w:tcW w:w="0" w:type="auto"/>
+            <w:vAlign w:val="center"/>
+            <w:hideMark/>
+          </w:tcPr>
+          <w:p>
+            <w:pPr>
+              <w:rPr>
+                <w:b/>
+                <w:bCs/>
+              </w:rPr>
+            </w:pPr>
+            <w:r>
+              <w:rPr>
+                <w:b/>
+                <w:bCs/>
+              </w:rPr>
+              <w:lastRenderedPageBreak/>
+              <w:t>category_ID</w:t>
+            </w:r>
+          </w:p>
+        </w:tc>
+        <w:tc>
+          <w:tcPr>
+            <w:tcW w:w="0" w:type="auto"/>
+            <w:vAlign w:val="center"/>
+            <w:hideMark/>
+          </w:tcPr>
+          <w:p>
+            <w:pPr>
+              <w:rPr>
+                <w:b/>
+                <w:bCs/>
+              </w:rPr>
+            </w:pPr>
+            <w:r>
+              <w:rPr>
+                <w:b/>
+                <w:bCs/>
+              </w:rPr>
+              <w:t>INT</w:t>
+            </w:r>
+          </w:p>
+        </w:tc>
+        <w:tc>
+          <w:tcPr>
+            <w:tcW w:w="0" w:type="auto"/>
+            <w:vAlign w:val="center"/>
+            <w:hideMark/>
+          </w:tcPr>
+          <w:p>
+            <w:pPr>
+              <w:rPr>
+                <w:b/>
+                <w:bCs/>
+              </w:rPr>
+            </w:pPr>
+            <w:r>
+              <w:rPr>
+                <w:b/>
+                <w:bCs/>
+              </w:rPr>
+              <w:t>FK → Category(category_ID)</w:t>
+            </w:r>
+          </w:p>
+        </w:tc>
+        <w:tc>
+          <w:tcPr>
+            <w:tcW w:w="0" w:type="auto"/>
+            <w:vAlign w:val="center"/>
+            <w:hideMark/>
+          </w:tcPr>
+          <w:p>
+            <w:pPr>
+              <w:rPr>
+                <w:b/>
+                <w:bCs/>
+              </w:rPr>
+            </w:pPr>
+            <w:r>
+              <w:rPr>
+                <w:b/>
+                <w:bCs/>
+              </w:rPr>
+              <w:t>Links product to its category</w:t>
             </w:r>
           </w:p>
         </w:tc>
@@ -762,7 +1689,7 @@
           <w:b/>
           <w:bCs/>
         </w:rPr>
-        <w:t>3. Product</w:t>
+        <w:t>Category Table</w:t>
       </w:r>
     </w:p>
     <w:tbl>
@@ -778,10 +1705,10 @@
         <w:tblLook w:val="04A0" w:firstRow="1" w:lastRow="0" w:firstColumn="1" w:lastColumn="0" w:noHBand="0" w:noVBand="1"/>
       </w:tblPr>
       <w:tblGrid>
-        <w:gridCol w:w="1316"/>
-        <w:gridCol w:w="1776"/>
-        <w:gridCol w:w="3002"/>
-        <w:gridCol w:w="3266"/>
+        <w:gridCol w:w="1836"/>
+        <w:gridCol w:w="1803"/>
+        <w:gridCol w:w="2596"/>
+        <w:gridCol w:w="3125"/>
       </w:tblGrid>
       <w:tr>
         <w:trPr>
@@ -888,19 +1815,39 @@
             <w:hideMark/>
           </w:tcPr>
           <w:p>
-            <w:r>
-              <w:t>product_id</w:t>
-            </w:r>
-          </w:p>
-        </w:tc>
-        <w:tc>
-          <w:tcPr>
-            <w:tcW w:w="0" w:type="auto"/>
-            <w:vAlign w:val="center"/>
-            <w:hideMark/>
-          </w:tcPr>
-          <w:p>
-            <w:r>
+            <w:pPr>
+              <w:rPr>
+                <w:b/>
+                <w:bCs/>
+              </w:rPr>
+            </w:pPr>
+            <w:r>
+              <w:rPr>
+                <w:b/>
+                <w:bCs/>
+              </w:rPr>
+              <w:t>category_ID</w:t>
+            </w:r>
+          </w:p>
+        </w:tc>
+        <w:tc>
+          <w:tcPr>
+            <w:tcW w:w="0" w:type="auto"/>
+            <w:vAlign w:val="center"/>
+            <w:hideMark/>
+          </w:tcPr>
+          <w:p>
+            <w:pPr>
+              <w:rPr>
+                <w:b/>
+                <w:bCs/>
+              </w:rPr>
+            </w:pPr>
+            <w:r>
+              <w:rPr>
+                <w:b/>
+                <w:bCs/>
+              </w:rPr>
               <w:t>INT</w:t>
             </w:r>
           </w:p>
@@ -912,7 +1859,17 @@
             <w:hideMark/>
           </w:tcPr>
           <w:p>
-            <w:r>
+            <w:pPr>
+              <w:rPr>
+                <w:b/>
+                <w:bCs/>
+              </w:rPr>
+            </w:pPr>
+            <w:r>
+              <w:rPr>
+                <w:b/>
+                <w:bCs/>
+              </w:rPr>
               <w:t>PK, AUTO_INCREMENT</w:t>
             </w:r>
           </w:p>
@@ -924,8 +1881,18 @@
             <w:hideMark/>
           </w:tcPr>
           <w:p>
-            <w:r>
-              <w:t>Unique identifier for each product</w:t>
+            <w:pPr>
+              <w:rPr>
+                <w:b/>
+                <w:bCs/>
+              </w:rPr>
+            </w:pPr>
+            <w:r>
+              <w:rPr>
+                <w:b/>
+                <w:bCs/>
+              </w:rPr>
+              <w:t>Unique identifier for each category</w:t>
             </w:r>
           </w:p>
         </w:tc>
@@ -941,72 +1908,39 @@
             <w:hideMark/>
           </w:tcPr>
           <w:p>
-            <w:r>
-              <w:t>category_id</w:t>
-            </w:r>
-          </w:p>
-        </w:tc>
-        <w:tc>
-          <w:tcPr>
-            <w:tcW w:w="0" w:type="auto"/>
-            <w:vAlign w:val="center"/>
-            <w:hideMark/>
-          </w:tcPr>
-          <w:p>
-            <w:r>
-              <w:t>INT</w:t>
-            </w:r>
-          </w:p>
-        </w:tc>
-        <w:tc>
-          <w:tcPr>
-            <w:tcW w:w="0" w:type="auto"/>
-            <w:vAlign w:val="center"/>
-            <w:hideMark/>
-          </w:tcPr>
-          <w:p>
-            <w:r>
-              <w:t>FK → Category(category_id)</w:t>
-            </w:r>
-          </w:p>
-        </w:tc>
-        <w:tc>
-          <w:tcPr>
-            <w:tcW w:w="0" w:type="auto"/>
-            <w:vAlign w:val="center"/>
-            <w:hideMark/>
-          </w:tcPr>
-          <w:p>
-            <w:r>
-              <w:t>Links product to its category</w:t>
-            </w:r>
-          </w:p>
-        </w:tc>
-      </w:tr>
-      <w:tr>
-        <w:trPr>
-          <w:tblCellSpacing w:w="15" w:type="dxa"/>
-        </w:trPr>
-        <w:tc>
-          <w:tcPr>
-            <w:tcW w:w="0" w:type="auto"/>
-            <w:vAlign w:val="center"/>
-            <w:hideMark/>
-          </w:tcPr>
-          <w:p>
-            <w:r>
-              <w:t>brand</w:t>
-            </w:r>
-          </w:p>
-        </w:tc>
-        <w:tc>
-          <w:tcPr>
-            <w:tcW w:w="0" w:type="auto"/>
-            <w:vAlign w:val="center"/>
-            <w:hideMark/>
-          </w:tcPr>
-          <w:p>
-            <w:r>
+            <w:pPr>
+              <w:rPr>
+                <w:b/>
+                <w:bCs/>
+              </w:rPr>
+            </w:pPr>
+            <w:r>
+              <w:rPr>
+                <w:b/>
+                <w:bCs/>
+              </w:rPr>
+              <w:t>category_name</w:t>
+            </w:r>
+          </w:p>
+        </w:tc>
+        <w:tc>
+          <w:tcPr>
+            <w:tcW w:w="0" w:type="auto"/>
+            <w:vAlign w:val="center"/>
+            <w:hideMark/>
+          </w:tcPr>
+          <w:p>
+            <w:pPr>
+              <w:rPr>
+                <w:b/>
+                <w:bCs/>
+              </w:rPr>
+            </w:pPr>
+            <w:r>
+              <w:rPr>
+                <w:b/>
+                <w:bCs/>
+              </w:rPr>
               <w:t>VARCHAR(100)</w:t>
             </w:r>
           </w:p>
@@ -1018,286 +1952,40 @@
             <w:hideMark/>
           </w:tcPr>
           <w:p>
-            <w:r>
-              <w:t>NULL</w:t>
-            </w:r>
-          </w:p>
-        </w:tc>
-        <w:tc>
-          <w:tcPr>
-            <w:tcW w:w="0" w:type="auto"/>
-            <w:vAlign w:val="center"/>
-            <w:hideMark/>
-          </w:tcPr>
-          <w:p>
-            <w:r>
-              <w:t>Brand name of product</w:t>
-            </w:r>
-          </w:p>
-        </w:tc>
-      </w:tr>
-      <w:tr>
-        <w:trPr>
-          <w:tblCellSpacing w:w="15" w:type="dxa"/>
-        </w:trPr>
-        <w:tc>
-          <w:tcPr>
-            <w:tcW w:w="0" w:type="auto"/>
-            <w:vAlign w:val="center"/>
-            <w:hideMark/>
-          </w:tcPr>
-          <w:p>
-            <w:r>
-              <w:t>stock</w:t>
-            </w:r>
-          </w:p>
-        </w:tc>
-        <w:tc>
-          <w:tcPr>
-            <w:tcW w:w="0" w:type="auto"/>
-            <w:vAlign w:val="center"/>
-            <w:hideMark/>
-          </w:tcPr>
-          <w:p>
-            <w:r>
-              <w:t>INT</w:t>
-            </w:r>
-          </w:p>
-        </w:tc>
-        <w:tc>
-          <w:tcPr>
-            <w:tcW w:w="0" w:type="auto"/>
-            <w:vAlign w:val="center"/>
-            <w:hideMark/>
-          </w:tcPr>
-          <w:p>
-            <w:r>
-              <w:t>DEFAULT 0</w:t>
-            </w:r>
-          </w:p>
-        </w:tc>
-        <w:tc>
-          <w:tcPr>
-            <w:tcW w:w="0" w:type="auto"/>
-            <w:vAlign w:val="center"/>
-            <w:hideMark/>
-          </w:tcPr>
-          <w:p>
-            <w:r>
-              <w:t>Available quantity in inventory</w:t>
-            </w:r>
-          </w:p>
-        </w:tc>
-      </w:tr>
-      <w:tr>
-        <w:trPr>
-          <w:tblCellSpacing w:w="15" w:type="dxa"/>
-        </w:trPr>
-        <w:tc>
-          <w:tcPr>
-            <w:tcW w:w="0" w:type="auto"/>
-            <w:vAlign w:val="center"/>
-            <w:hideMark/>
-          </w:tcPr>
-          <w:p>
-            <w:r>
-              <w:lastRenderedPageBreak/>
-              <w:t>image</w:t>
-            </w:r>
-          </w:p>
-        </w:tc>
-        <w:tc>
-          <w:tcPr>
-            <w:tcW w:w="0" w:type="auto"/>
-            <w:vAlign w:val="center"/>
-            <w:hideMark/>
-          </w:tcPr>
-          <w:p>
-            <w:r>
-              <w:t>VARCHAR(255)</w:t>
-            </w:r>
-          </w:p>
-        </w:tc>
-        <w:tc>
-          <w:tcPr>
-            <w:tcW w:w="0" w:type="auto"/>
-            <w:vAlign w:val="center"/>
-            <w:hideMark/>
-          </w:tcPr>
-          <w:p>
-            <w:r>
-              <w:t>NULL</w:t>
-            </w:r>
-          </w:p>
-        </w:tc>
-        <w:tc>
-          <w:tcPr>
-            <w:tcW w:w="0" w:type="auto"/>
-            <w:vAlign w:val="center"/>
-            <w:hideMark/>
-          </w:tcPr>
-          <w:p>
-            <w:r>
-              <w:t>Path/filename of product image</w:t>
-            </w:r>
-          </w:p>
-        </w:tc>
-      </w:tr>
-      <w:tr>
-        <w:trPr>
-          <w:tblCellSpacing w:w="15" w:type="dxa"/>
-        </w:trPr>
-        <w:tc>
-          <w:tcPr>
-            <w:tcW w:w="0" w:type="auto"/>
-            <w:vAlign w:val="center"/>
-            <w:hideMark/>
-          </w:tcPr>
-          <w:p>
-            <w:r>
-              <w:t>price</w:t>
-            </w:r>
-          </w:p>
-        </w:tc>
-        <w:tc>
-          <w:tcPr>
-            <w:tcW w:w="0" w:type="auto"/>
-            <w:vAlign w:val="center"/>
-            <w:hideMark/>
-          </w:tcPr>
-          <w:p>
-            <w:r>
-              <w:t>DECIMAL(10,2)</w:t>
-            </w:r>
-          </w:p>
-        </w:tc>
-        <w:tc>
-          <w:tcPr>
-            <w:tcW w:w="0" w:type="auto"/>
-            <w:vAlign w:val="center"/>
-            <w:hideMark/>
-          </w:tcPr>
-          <w:p>
-            <w:r>
-              <w:t>NOT NULL</w:t>
-            </w:r>
-          </w:p>
-        </w:tc>
-        <w:tc>
-          <w:tcPr>
-            <w:tcW w:w="0" w:type="auto"/>
-            <w:vAlign w:val="center"/>
-            <w:hideMark/>
-          </w:tcPr>
-          <w:p>
-            <w:r>
-              <w:t>Price of product</w:t>
-            </w:r>
-          </w:p>
-        </w:tc>
-      </w:tr>
-      <w:tr>
-        <w:trPr>
-          <w:tblCellSpacing w:w="15" w:type="dxa"/>
-        </w:trPr>
-        <w:tc>
-          <w:tcPr>
-            <w:tcW w:w="0" w:type="auto"/>
-            <w:vAlign w:val="center"/>
-            <w:hideMark/>
-          </w:tcPr>
-          <w:p>
-            <w:r>
-              <w:t>name</w:t>
-            </w:r>
-          </w:p>
-        </w:tc>
-        <w:tc>
-          <w:tcPr>
-            <w:tcW w:w="0" w:type="auto"/>
-            <w:vAlign w:val="center"/>
-            <w:hideMark/>
-          </w:tcPr>
-          <w:p>
-            <w:r>
-              <w:t>VARCHAR(100)</w:t>
-            </w:r>
-          </w:p>
-        </w:tc>
-        <w:tc>
-          <w:tcPr>
-            <w:tcW w:w="0" w:type="auto"/>
-            <w:vAlign w:val="center"/>
-            <w:hideMark/>
-          </w:tcPr>
-          <w:p>
-            <w:r>
-              <w:t>NOT NULL</w:t>
-            </w:r>
-          </w:p>
-        </w:tc>
-        <w:tc>
-          <w:tcPr>
-            <w:tcW w:w="0" w:type="auto"/>
-            <w:vAlign w:val="center"/>
-            <w:hideMark/>
-          </w:tcPr>
-          <w:p>
-            <w:r>
-              <w:t>Product name</w:t>
-            </w:r>
-          </w:p>
-        </w:tc>
-      </w:tr>
-      <w:tr>
-        <w:trPr>
-          <w:tblCellSpacing w:w="15" w:type="dxa"/>
-        </w:trPr>
-        <w:tc>
-          <w:tcPr>
-            <w:tcW w:w="0" w:type="auto"/>
-            <w:vAlign w:val="center"/>
-            <w:hideMark/>
-          </w:tcPr>
-          <w:p>
-            <w:r>
-              <w:t>description</w:t>
-            </w:r>
-          </w:p>
-        </w:tc>
-        <w:tc>
-          <w:tcPr>
-            <w:tcW w:w="0" w:type="auto"/>
-            <w:vAlign w:val="center"/>
-            <w:hideMark/>
-          </w:tcPr>
-          <w:p>
-            <w:r>
-              <w:t>TEXT</w:t>
-            </w:r>
-          </w:p>
-        </w:tc>
-        <w:tc>
-          <w:tcPr>
-            <w:tcW w:w="0" w:type="auto"/>
-            <w:vAlign w:val="center"/>
-            <w:hideMark/>
-          </w:tcPr>
-          <w:p>
-            <w:r>
-              <w:t>NULL</w:t>
-            </w:r>
-          </w:p>
-        </w:tc>
-        <w:tc>
-          <w:tcPr>
-            <w:tcW w:w="0" w:type="auto"/>
-            <w:vAlign w:val="center"/>
-            <w:hideMark/>
-          </w:tcPr>
-          <w:p>
-            <w:r>
-              <w:t>Detailed product description</w:t>
+            <w:pPr>
+              <w:rPr>
+                <w:b/>
+                <w:bCs/>
+              </w:rPr>
+            </w:pPr>
+            <w:r>
+              <w:rPr>
+                <w:b/>
+                <w:bCs/>
+              </w:rPr>
+              <w:t>NOT NULL, UNIQUE</w:t>
+            </w:r>
+          </w:p>
+        </w:tc>
+        <w:tc>
+          <w:tcPr>
+            <w:tcW w:w="0" w:type="auto"/>
+            <w:vAlign w:val="center"/>
+            <w:hideMark/>
+          </w:tcPr>
+          <w:p>
+            <w:pPr>
+              <w:rPr>
+                <w:b/>
+                <w:bCs/>
+              </w:rPr>
+            </w:pPr>
+            <w:r>
+              <w:rPr>
+                <w:b/>
+                <w:bCs/>
+              </w:rPr>
+              <w:t>Name of the category</w:t>
             </w:r>
           </w:p>
         </w:tc>
@@ -1315,7 +2003,7 @@
           <w:b/>
           <w:bCs/>
         </w:rPr>
-        <w:t>4. Order</w:t>
+        <w:t>Order Table</w:t>
       </w:r>
     </w:p>
     <w:tbl>
@@ -1331,10 +2019,10 @@
         <w:tblLook w:val="04A0" w:firstRow="1" w:lastRow="0" w:firstColumn="1" w:lastColumn="0" w:noHBand="0" w:noVBand="1"/>
       </w:tblPr>
       <w:tblGrid>
-        <w:gridCol w:w="1463"/>
-        <w:gridCol w:w="2926"/>
-        <w:gridCol w:w="3025"/>
-        <w:gridCol w:w="1946"/>
+        <w:gridCol w:w="1582"/>
+        <w:gridCol w:w="3081"/>
+        <w:gridCol w:w="2453"/>
+        <w:gridCol w:w="2244"/>
       </w:tblGrid>
       <w:tr>
         <w:trPr>
@@ -1441,19 +2129,39 @@
             <w:hideMark/>
           </w:tcPr>
           <w:p>
-            <w:r>
-              <w:t>order_id</w:t>
-            </w:r>
-          </w:p>
-        </w:tc>
-        <w:tc>
-          <w:tcPr>
-            <w:tcW w:w="0" w:type="auto"/>
-            <w:vAlign w:val="center"/>
-            <w:hideMark/>
-          </w:tcPr>
-          <w:p>
-            <w:r>
+            <w:pPr>
+              <w:rPr>
+                <w:b/>
+                <w:bCs/>
+              </w:rPr>
+            </w:pPr>
+            <w:r>
+              <w:rPr>
+                <w:b/>
+                <w:bCs/>
+              </w:rPr>
+              <w:t>order_ID</w:t>
+            </w:r>
+          </w:p>
+        </w:tc>
+        <w:tc>
+          <w:tcPr>
+            <w:tcW w:w="0" w:type="auto"/>
+            <w:vAlign w:val="center"/>
+            <w:hideMark/>
+          </w:tcPr>
+          <w:p>
+            <w:pPr>
+              <w:rPr>
+                <w:b/>
+                <w:bCs/>
+              </w:rPr>
+            </w:pPr>
+            <w:r>
+              <w:rPr>
+                <w:b/>
+                <w:bCs/>
+              </w:rPr>
               <w:t>INT</w:t>
             </w:r>
           </w:p>
@@ -1465,7 +2173,17 @@
             <w:hideMark/>
           </w:tcPr>
           <w:p>
-            <w:r>
+            <w:pPr>
+              <w:rPr>
+                <w:b/>
+                <w:bCs/>
+              </w:rPr>
+            </w:pPr>
+            <w:r>
+              <w:rPr>
+                <w:b/>
+                <w:bCs/>
+              </w:rPr>
               <w:t>PK, AUTO_INCREMENT</w:t>
             </w:r>
           </w:p>
@@ -1477,7 +2195,17 @@
             <w:hideMark/>
           </w:tcPr>
           <w:p>
-            <w:r>
+            <w:pPr>
+              <w:rPr>
+                <w:b/>
+                <w:bCs/>
+              </w:rPr>
+            </w:pPr>
+            <w:r>
+              <w:rPr>
+                <w:b/>
+                <w:bCs/>
+              </w:rPr>
               <w:t>Unique identifier for each order</w:t>
             </w:r>
           </w:p>
@@ -1494,19 +2222,39 @@
             <w:hideMark/>
           </w:tcPr>
           <w:p>
-            <w:r>
-              <w:t>customer_id</w:t>
-            </w:r>
-          </w:p>
-        </w:tc>
-        <w:tc>
-          <w:tcPr>
-            <w:tcW w:w="0" w:type="auto"/>
-            <w:vAlign w:val="center"/>
-            <w:hideMark/>
-          </w:tcPr>
-          <w:p>
-            <w:r>
+            <w:pPr>
+              <w:rPr>
+                <w:b/>
+                <w:bCs/>
+              </w:rPr>
+            </w:pPr>
+            <w:r>
+              <w:rPr>
+                <w:b/>
+                <w:bCs/>
+              </w:rPr>
+              <w:t>user_ID</w:t>
+            </w:r>
+          </w:p>
+        </w:tc>
+        <w:tc>
+          <w:tcPr>
+            <w:tcW w:w="0" w:type="auto"/>
+            <w:vAlign w:val="center"/>
+            <w:hideMark/>
+          </w:tcPr>
+          <w:p>
+            <w:pPr>
+              <w:rPr>
+                <w:b/>
+                <w:bCs/>
+              </w:rPr>
+            </w:pPr>
+            <w:r>
+              <w:rPr>
+                <w:b/>
+                <w:bCs/>
+              </w:rPr>
               <w:t>INT</w:t>
             </w:r>
           </w:p>
@@ -1518,20 +2266,40 @@
             <w:hideMark/>
           </w:tcPr>
           <w:p>
-            <w:r>
-              <w:t>FK → Customer(customer_id)</w:t>
-            </w:r>
-          </w:p>
-        </w:tc>
-        <w:tc>
-          <w:tcPr>
-            <w:tcW w:w="0" w:type="auto"/>
-            <w:vAlign w:val="center"/>
-            <w:hideMark/>
-          </w:tcPr>
-          <w:p>
-            <w:r>
-              <w:t>Links order to customer</w:t>
+            <w:pPr>
+              <w:rPr>
+                <w:b/>
+                <w:bCs/>
+              </w:rPr>
+            </w:pPr>
+            <w:r>
+              <w:rPr>
+                <w:b/>
+                <w:bCs/>
+              </w:rPr>
+              <w:t>FK → User(user_ID)</w:t>
+            </w:r>
+          </w:p>
+        </w:tc>
+        <w:tc>
+          <w:tcPr>
+            <w:tcW w:w="0" w:type="auto"/>
+            <w:vAlign w:val="center"/>
+            <w:hideMark/>
+          </w:tcPr>
+          <w:p>
+            <w:pPr>
+              <w:rPr>
+                <w:b/>
+                <w:bCs/>
+              </w:rPr>
+            </w:pPr>
+            <w:r>
+              <w:rPr>
+                <w:b/>
+                <w:bCs/>
+              </w:rPr>
+              <w:t>User who placed the order</w:t>
             </w:r>
           </w:p>
         </w:tc>
@@ -1547,7 +2315,17 @@
             <w:hideMark/>
           </w:tcPr>
           <w:p>
-            <w:r>
+            <w:pPr>
+              <w:rPr>
+                <w:b/>
+                <w:bCs/>
+              </w:rPr>
+            </w:pPr>
+            <w:r>
+              <w:rPr>
+                <w:b/>
+                <w:bCs/>
+              </w:rPr>
               <w:t>order_date</w:t>
             </w:r>
           </w:p>
@@ -1559,7 +2337,17 @@
             <w:hideMark/>
           </w:tcPr>
           <w:p>
-            <w:r>
+            <w:pPr>
+              <w:rPr>
+                <w:b/>
+                <w:bCs/>
+              </w:rPr>
+            </w:pPr>
+            <w:r>
+              <w:rPr>
+                <w:b/>
+                <w:bCs/>
+              </w:rPr>
               <w:t>DATETIME</w:t>
             </w:r>
           </w:p>
@@ -1571,19 +2359,39 @@
             <w:hideMark/>
           </w:tcPr>
           <w:p>
-            <w:r>
-              <w:t>DEFAULT CURRENT_TIMESTAMP</w:t>
-            </w:r>
-          </w:p>
-        </w:tc>
-        <w:tc>
-          <w:tcPr>
-            <w:tcW w:w="0" w:type="auto"/>
-            <w:vAlign w:val="center"/>
-            <w:hideMark/>
-          </w:tcPr>
-          <w:p>
-            <w:r>
+            <w:pPr>
+              <w:rPr>
+                <w:b/>
+                <w:bCs/>
+              </w:rPr>
+            </w:pPr>
+            <w:r>
+              <w:rPr>
+                <w:b/>
+                <w:bCs/>
+              </w:rPr>
+              <w:t>NOT NULL</w:t>
+            </w:r>
+          </w:p>
+        </w:tc>
+        <w:tc>
+          <w:tcPr>
+            <w:tcW w:w="0" w:type="auto"/>
+            <w:vAlign w:val="center"/>
+            <w:hideMark/>
+          </w:tcPr>
+          <w:p>
+            <w:pPr>
+              <w:rPr>
+                <w:b/>
+                <w:bCs/>
+              </w:rPr>
+            </w:pPr>
+            <w:r>
+              <w:rPr>
+                <w:b/>
+                <w:bCs/>
+              </w:rPr>
               <w:t>Date and time of order placement</w:t>
             </w:r>
           </w:p>
@@ -1600,7 +2408,17 @@
             <w:hideMark/>
           </w:tcPr>
           <w:p>
-            <w:r>
+            <w:pPr>
+              <w:rPr>
+                <w:b/>
+                <w:bCs/>
+              </w:rPr>
+            </w:pPr>
+            <w:r>
+              <w:rPr>
+                <w:b/>
+                <w:bCs/>
+              </w:rPr>
               <w:t>total_amount</w:t>
             </w:r>
           </w:p>
@@ -1612,7 +2430,17 @@
             <w:hideMark/>
           </w:tcPr>
           <w:p>
-            <w:r>
+            <w:pPr>
+              <w:rPr>
+                <w:b/>
+                <w:bCs/>
+              </w:rPr>
+            </w:pPr>
+            <w:r>
+              <w:rPr>
+                <w:b/>
+                <w:bCs/>
+              </w:rPr>
               <w:t>DECIMAL(10,2)</w:t>
             </w:r>
           </w:p>
@@ -1624,19 +2452,39 @@
             <w:hideMark/>
           </w:tcPr>
           <w:p>
-            <w:r>
-              <w:t>NULL</w:t>
-            </w:r>
-          </w:p>
-        </w:tc>
-        <w:tc>
-          <w:tcPr>
-            <w:tcW w:w="0" w:type="auto"/>
-            <w:vAlign w:val="center"/>
-            <w:hideMark/>
-          </w:tcPr>
-          <w:p>
-            <w:r>
+            <w:pPr>
+              <w:rPr>
+                <w:b/>
+                <w:bCs/>
+              </w:rPr>
+            </w:pPr>
+            <w:r>
+              <w:rPr>
+                <w:b/>
+                <w:bCs/>
+              </w:rPr>
+              <w:t>NOT NULL</w:t>
+            </w:r>
+          </w:p>
+        </w:tc>
+        <w:tc>
+          <w:tcPr>
+            <w:tcW w:w="0" w:type="auto"/>
+            <w:vAlign w:val="center"/>
+            <w:hideMark/>
+          </w:tcPr>
+          <w:p>
+            <w:pPr>
+              <w:rPr>
+                <w:b/>
+                <w:bCs/>
+              </w:rPr>
+            </w:pPr>
+            <w:r>
+              <w:rPr>
+                <w:b/>
+                <w:bCs/>
+              </w:rPr>
               <w:t>Total cost of the order</w:t>
             </w:r>
           </w:p>
@@ -1653,7 +2501,17 @@
             <w:hideMark/>
           </w:tcPr>
           <w:p>
-            <w:r>
+            <w:pPr>
+              <w:rPr>
+                <w:b/>
+                <w:bCs/>
+              </w:rPr>
+            </w:pPr>
+            <w:r>
+              <w:rPr>
+                <w:b/>
+                <w:bCs/>
+              </w:rPr>
               <w:t>status</w:t>
             </w:r>
           </w:p>
@@ -1665,31 +2523,61 @@
             <w:hideMark/>
           </w:tcPr>
           <w:p>
-            <w:r>
-              <w:t>ENUM(Pending, Confirmed, Shipped, Delivered, Cancelled)</w:t>
-            </w:r>
-          </w:p>
-        </w:tc>
-        <w:tc>
-          <w:tcPr>
-            <w:tcW w:w="0" w:type="auto"/>
-            <w:vAlign w:val="center"/>
-            <w:hideMark/>
-          </w:tcPr>
-          <w:p>
-            <w:r>
-              <w:t>DEFAULT 'Pending'</w:t>
-            </w:r>
-          </w:p>
-        </w:tc>
-        <w:tc>
-          <w:tcPr>
-            <w:tcW w:w="0" w:type="auto"/>
-            <w:vAlign w:val="center"/>
-            <w:hideMark/>
-          </w:tcPr>
-          <w:p>
-            <w:r>
+            <w:pPr>
+              <w:rPr>
+                <w:b/>
+                <w:bCs/>
+              </w:rPr>
+            </w:pPr>
+            <w:r>
+              <w:rPr>
+                <w:b/>
+                <w:bCs/>
+              </w:rPr>
+              <w:t>ENUM(Pending, Shipped, Delivered, Cancelled)</w:t>
+            </w:r>
+          </w:p>
+        </w:tc>
+        <w:tc>
+          <w:tcPr>
+            <w:tcW w:w="0" w:type="auto"/>
+            <w:vAlign w:val="center"/>
+            <w:hideMark/>
+          </w:tcPr>
+          <w:p>
+            <w:pPr>
+              <w:rPr>
+                <w:b/>
+                <w:bCs/>
+              </w:rPr>
+            </w:pPr>
+            <w:r>
+              <w:rPr>
+                <w:b/>
+                <w:bCs/>
+              </w:rPr>
+              <w:t>NOT NULL</w:t>
+            </w:r>
+          </w:p>
+        </w:tc>
+        <w:tc>
+          <w:tcPr>
+            <w:tcW w:w="0" w:type="auto"/>
+            <w:vAlign w:val="center"/>
+            <w:hideMark/>
+          </w:tcPr>
+          <w:p>
+            <w:pPr>
+              <w:rPr>
+                <w:b/>
+                <w:bCs/>
+              </w:rPr>
+            </w:pPr>
+            <w:r>
+              <w:rPr>
+                <w:b/>
+                <w:bCs/>
+              </w:rPr>
               <w:t>Current order status</w:t>
             </w:r>
           </w:p>
@@ -1708,7 +2596,7 @@
           <w:b/>
           <w:bCs/>
         </w:rPr>
-        <w:t>5. Order_Item</w:t>
+        <w:t>Order_Item Table</w:t>
       </w:r>
     </w:p>
     <w:tbl>
@@ -1724,10 +2612,10 @@
         <w:tblLook w:val="04A0" w:firstRow="1" w:lastRow="0" w:firstColumn="1" w:lastColumn="0" w:noHBand="0" w:noVBand="1"/>
       </w:tblPr>
       <w:tblGrid>
-        <w:gridCol w:w="1543"/>
-        <w:gridCol w:w="1754"/>
-        <w:gridCol w:w="2723"/>
-        <w:gridCol w:w="3340"/>
+        <w:gridCol w:w="1689"/>
+        <w:gridCol w:w="1781"/>
+        <w:gridCol w:w="2797"/>
+        <w:gridCol w:w="3093"/>
       </w:tblGrid>
       <w:tr>
         <w:trPr>
@@ -1834,19 +2722,39 @@
             <w:hideMark/>
           </w:tcPr>
           <w:p>
-            <w:r>
-              <w:t>order_item_id</w:t>
-            </w:r>
-          </w:p>
-        </w:tc>
-        <w:tc>
-          <w:tcPr>
-            <w:tcW w:w="0" w:type="auto"/>
-            <w:vAlign w:val="center"/>
-            <w:hideMark/>
-          </w:tcPr>
-          <w:p>
-            <w:r>
+            <w:pPr>
+              <w:rPr>
+                <w:b/>
+                <w:bCs/>
+              </w:rPr>
+            </w:pPr>
+            <w:r>
+              <w:rPr>
+                <w:b/>
+                <w:bCs/>
+              </w:rPr>
+              <w:t>order_item_ID</w:t>
+            </w:r>
+          </w:p>
+        </w:tc>
+        <w:tc>
+          <w:tcPr>
+            <w:tcW w:w="0" w:type="auto"/>
+            <w:vAlign w:val="center"/>
+            <w:hideMark/>
+          </w:tcPr>
+          <w:p>
+            <w:pPr>
+              <w:rPr>
+                <w:b/>
+                <w:bCs/>
+              </w:rPr>
+            </w:pPr>
+            <w:r>
+              <w:rPr>
+                <w:b/>
+                <w:bCs/>
+              </w:rPr>
               <w:t>INT</w:t>
             </w:r>
           </w:p>
@@ -1858,7 +2766,17 @@
             <w:hideMark/>
           </w:tcPr>
           <w:p>
-            <w:r>
+            <w:pPr>
+              <w:rPr>
+                <w:b/>
+                <w:bCs/>
+              </w:rPr>
+            </w:pPr>
+            <w:r>
+              <w:rPr>
+                <w:b/>
+                <w:bCs/>
+              </w:rPr>
               <w:t>PK, AUTO_INCREMENT</w:t>
             </w:r>
           </w:p>
@@ -1870,7 +2788,17 @@
             <w:hideMark/>
           </w:tcPr>
           <w:p>
-            <w:r>
+            <w:pPr>
+              <w:rPr>
+                <w:b/>
+                <w:bCs/>
+              </w:rPr>
+            </w:pPr>
+            <w:r>
+              <w:rPr>
+                <w:b/>
+                <w:bCs/>
+              </w:rPr>
               <w:t>Unique identifier for each order item</w:t>
             </w:r>
           </w:p>
@@ -1887,19 +2815,39 @@
             <w:hideMark/>
           </w:tcPr>
           <w:p>
-            <w:r>
-              <w:t>product_id</w:t>
-            </w:r>
-          </w:p>
-        </w:tc>
-        <w:tc>
-          <w:tcPr>
-            <w:tcW w:w="0" w:type="auto"/>
-            <w:vAlign w:val="center"/>
-            <w:hideMark/>
-          </w:tcPr>
-          <w:p>
-            <w:r>
+            <w:pPr>
+              <w:rPr>
+                <w:b/>
+                <w:bCs/>
+              </w:rPr>
+            </w:pPr>
+            <w:r>
+              <w:rPr>
+                <w:b/>
+                <w:bCs/>
+              </w:rPr>
+              <w:t>product_ID</w:t>
+            </w:r>
+          </w:p>
+        </w:tc>
+        <w:tc>
+          <w:tcPr>
+            <w:tcW w:w="0" w:type="auto"/>
+            <w:vAlign w:val="center"/>
+            <w:hideMark/>
+          </w:tcPr>
+          <w:p>
+            <w:pPr>
+              <w:rPr>
+                <w:b/>
+                <w:bCs/>
+              </w:rPr>
+            </w:pPr>
+            <w:r>
+              <w:rPr>
+                <w:b/>
+                <w:bCs/>
+              </w:rPr>
               <w:t>INT</w:t>
             </w:r>
           </w:p>
@@ -1911,20 +2859,40 @@
             <w:hideMark/>
           </w:tcPr>
           <w:p>
-            <w:r>
-              <w:t>FK → Product(product_id)</w:t>
-            </w:r>
-          </w:p>
-        </w:tc>
-        <w:tc>
-          <w:tcPr>
-            <w:tcW w:w="0" w:type="auto"/>
-            <w:vAlign w:val="center"/>
-            <w:hideMark/>
-          </w:tcPr>
-          <w:p>
-            <w:r>
-              <w:t>Links item to product</w:t>
+            <w:pPr>
+              <w:rPr>
+                <w:b/>
+                <w:bCs/>
+              </w:rPr>
+            </w:pPr>
+            <w:r>
+              <w:rPr>
+                <w:b/>
+                <w:bCs/>
+              </w:rPr>
+              <w:t>FK → Product(product_ID)</w:t>
+            </w:r>
+          </w:p>
+        </w:tc>
+        <w:tc>
+          <w:tcPr>
+            <w:tcW w:w="0" w:type="auto"/>
+            <w:vAlign w:val="center"/>
+            <w:hideMark/>
+          </w:tcPr>
+          <w:p>
+            <w:pPr>
+              <w:rPr>
+                <w:b/>
+                <w:bCs/>
+              </w:rPr>
+            </w:pPr>
+            <w:r>
+              <w:rPr>
+                <w:b/>
+                <w:bCs/>
+              </w:rPr>
+              <w:t>Product included in the order</w:t>
             </w:r>
           </w:p>
         </w:tc>
@@ -1940,19 +2908,39 @@
             <w:hideMark/>
           </w:tcPr>
           <w:p>
-            <w:r>
-              <w:t>order_id</w:t>
-            </w:r>
-          </w:p>
-        </w:tc>
-        <w:tc>
-          <w:tcPr>
-            <w:tcW w:w="0" w:type="auto"/>
-            <w:vAlign w:val="center"/>
-            <w:hideMark/>
-          </w:tcPr>
-          <w:p>
-            <w:r>
+            <w:pPr>
+              <w:rPr>
+                <w:b/>
+                <w:bCs/>
+              </w:rPr>
+            </w:pPr>
+            <w:r>
+              <w:rPr>
+                <w:b/>
+                <w:bCs/>
+              </w:rPr>
+              <w:t>order_ID</w:t>
+            </w:r>
+          </w:p>
+        </w:tc>
+        <w:tc>
+          <w:tcPr>
+            <w:tcW w:w="0" w:type="auto"/>
+            <w:vAlign w:val="center"/>
+            <w:hideMark/>
+          </w:tcPr>
+          <w:p>
+            <w:pPr>
+              <w:rPr>
+                <w:b/>
+                <w:bCs/>
+              </w:rPr>
+            </w:pPr>
+            <w:r>
+              <w:rPr>
+                <w:b/>
+                <w:bCs/>
+              </w:rPr>
               <w:t>INT</w:t>
             </w:r>
           </w:p>
@@ -1964,20 +2952,40 @@
             <w:hideMark/>
           </w:tcPr>
           <w:p>
-            <w:r>
-              <w:t>FK → Order(order_id)</w:t>
-            </w:r>
-          </w:p>
-        </w:tc>
-        <w:tc>
-          <w:tcPr>
-            <w:tcW w:w="0" w:type="auto"/>
-            <w:vAlign w:val="center"/>
-            <w:hideMark/>
-          </w:tcPr>
-          <w:p>
-            <w:r>
-              <w:t>Links item to order</w:t>
+            <w:pPr>
+              <w:rPr>
+                <w:b/>
+                <w:bCs/>
+              </w:rPr>
+            </w:pPr>
+            <w:r>
+              <w:rPr>
+                <w:b/>
+                <w:bCs/>
+              </w:rPr>
+              <w:t>FK → Order(order_ID)</w:t>
+            </w:r>
+          </w:p>
+        </w:tc>
+        <w:tc>
+          <w:tcPr>
+            <w:tcW w:w="0" w:type="auto"/>
+            <w:vAlign w:val="center"/>
+            <w:hideMark/>
+          </w:tcPr>
+          <w:p>
+            <w:pPr>
+              <w:rPr>
+                <w:b/>
+                <w:bCs/>
+              </w:rPr>
+            </w:pPr>
+            <w:r>
+              <w:rPr>
+                <w:b/>
+                <w:bCs/>
+              </w:rPr>
+              <w:t>Order to which this item belongs</w:t>
             </w:r>
           </w:p>
         </w:tc>
@@ -1993,7 +3001,18 @@
             <w:hideMark/>
           </w:tcPr>
           <w:p>
-            <w:r>
+            <w:pPr>
+              <w:rPr>
+                <w:b/>
+                <w:bCs/>
+              </w:rPr>
+            </w:pPr>
+            <w:r>
+              <w:rPr>
+                <w:b/>
+                <w:bCs/>
+              </w:rPr>
+              <w:lastRenderedPageBreak/>
               <w:t>price</w:t>
             </w:r>
           </w:p>
@@ -2005,7 +3024,17 @@
             <w:hideMark/>
           </w:tcPr>
           <w:p>
-            <w:r>
+            <w:pPr>
+              <w:rPr>
+                <w:b/>
+                <w:bCs/>
+              </w:rPr>
+            </w:pPr>
+            <w:r>
+              <w:rPr>
+                <w:b/>
+                <w:bCs/>
+              </w:rPr>
               <w:t>DECIMAL(10,2)</w:t>
             </w:r>
           </w:p>
@@ -2017,20 +3046,40 @@
             <w:hideMark/>
           </w:tcPr>
           <w:p>
-            <w:r>
-              <w:t>NULL</w:t>
-            </w:r>
-          </w:p>
-        </w:tc>
-        <w:tc>
-          <w:tcPr>
-            <w:tcW w:w="0" w:type="auto"/>
-            <w:vAlign w:val="center"/>
-            <w:hideMark/>
-          </w:tcPr>
-          <w:p>
-            <w:r>
-              <w:t>Price of product at order time</w:t>
+            <w:pPr>
+              <w:rPr>
+                <w:b/>
+                <w:bCs/>
+              </w:rPr>
+            </w:pPr>
+            <w:r>
+              <w:rPr>
+                <w:b/>
+                <w:bCs/>
+              </w:rPr>
+              <w:t>NOT NULL</w:t>
+            </w:r>
+          </w:p>
+        </w:tc>
+        <w:tc>
+          <w:tcPr>
+            <w:tcW w:w="0" w:type="auto"/>
+            <w:vAlign w:val="center"/>
+            <w:hideMark/>
+          </w:tcPr>
+          <w:p>
+            <w:pPr>
+              <w:rPr>
+                <w:b/>
+                <w:bCs/>
+              </w:rPr>
+            </w:pPr>
+            <w:r>
+              <w:rPr>
+                <w:b/>
+                <w:bCs/>
+              </w:rPr>
+              <w:t>Price of the product at purchase time</w:t>
             </w:r>
           </w:p>
         </w:tc>
@@ -2046,7 +3095,17 @@
             <w:hideMark/>
           </w:tcPr>
           <w:p>
-            <w:r>
+            <w:pPr>
+              <w:rPr>
+                <w:b/>
+                <w:bCs/>
+              </w:rPr>
+            </w:pPr>
+            <w:r>
+              <w:rPr>
+                <w:b/>
+                <w:bCs/>
+              </w:rPr>
               <w:t>quantity</w:t>
             </w:r>
           </w:p>
@@ -2058,7 +3117,17 @@
             <w:hideMark/>
           </w:tcPr>
           <w:p>
-            <w:r>
+            <w:pPr>
+              <w:rPr>
+                <w:b/>
+                <w:bCs/>
+              </w:rPr>
+            </w:pPr>
+            <w:r>
+              <w:rPr>
+                <w:b/>
+                <w:bCs/>
+              </w:rPr>
               <w:t>INT</w:t>
             </w:r>
           </w:p>
@@ -2070,20 +3139,40 @@
             <w:hideMark/>
           </w:tcPr>
           <w:p>
-            <w:r>
-              <w:t>NULL</w:t>
-            </w:r>
-          </w:p>
-        </w:tc>
-        <w:tc>
-          <w:tcPr>
-            <w:tcW w:w="0" w:type="auto"/>
-            <w:vAlign w:val="center"/>
-            <w:hideMark/>
-          </w:tcPr>
-          <w:p>
-            <w:r>
-              <w:t>Quantity of product ordered</w:t>
+            <w:pPr>
+              <w:rPr>
+                <w:b/>
+                <w:bCs/>
+              </w:rPr>
+            </w:pPr>
+            <w:r>
+              <w:rPr>
+                <w:b/>
+                <w:bCs/>
+              </w:rPr>
+              <w:t>NOT NULL</w:t>
+            </w:r>
+          </w:p>
+        </w:tc>
+        <w:tc>
+          <w:tcPr>
+            <w:tcW w:w="0" w:type="auto"/>
+            <w:vAlign w:val="center"/>
+            <w:hideMark/>
+          </w:tcPr>
+          <w:p>
+            <w:pPr>
+              <w:rPr>
+                <w:b/>
+                <w:bCs/>
+              </w:rPr>
+            </w:pPr>
+            <w:r>
+              <w:rPr>
+                <w:b/>
+                <w:bCs/>
+              </w:rPr>
+              <w:t>Number of units ordered</w:t>
             </w:r>
           </w:p>
         </w:tc>

</xml_diff>